<commit_message>
update Agent - dafe event in SQLLite instead json
</commit_message>
<xml_diff>
--- a/sqlLite ot json .docx
+++ b/sqlLite ot json .docx
@@ -3,11 +3,6 @@
 <w:document xmlns:wpc="http://schemas.microsoft.com/office/word/2010/wordprocessingCanvas" xmlns:cx="http://schemas.microsoft.com/office/drawing/2014/chartex" xmlns:cx1="http://schemas.microsoft.com/office/drawing/2015/9/8/chartex" xmlns:cx2="http://schemas.microsoft.com/office/drawing/2015/10/21/chartex" xmlns:cx3="http://schemas.microsoft.com/office/drawing/2016/5/9/chartex" xmlns:cx4="http://schemas.microsoft.com/office/drawing/2016/5/10/chartex" xmlns:cx5="http://schemas.microsoft.com/office/drawing/2016/5/11/chartex" xmlns:cx6="http://schemas.microsoft.com/office/drawing/2016/5/12/chartex" xmlns:cx7="http://schemas.microsoft.com/office/drawing/2016/5/13/chartex" xmlns:cx8="http://schemas.microsoft.com/office/drawing/2016/5/14/chartex" xmlns:mc="http://schemas.openxmlformats.org/markup-compatibility/2006" xmlns:aink="http://schemas.microsoft.com/office/drawing/2016/ink" xmlns:am3d="http://schemas.microsoft.com/office/drawing/2017/model3d" xmlns:o="urn:schemas-microsoft-com:office:office" xmlns:oel="http://schemas.microsoft.com/office/2019/extlst" xmlns:r="http://schemas.openxmlformats.org/officeDocument/2006/relationships" xmlns:m="http://schemas.openxmlformats.org/officeDocument/2006/math" xmlns:v="urn:schemas-microsoft-com:vml" xmlns:wp14="http://schemas.microsoft.com/office/word/2010/wordprocessingDrawing" xmlns:wp="http://schemas.openxmlformats.org/drawingml/2006/wordprocessingDrawing" xmlns:w10="urn:schemas-microsoft-com:office:word" xmlns:w="http://schemas.openxmlformats.org/wordprocessingml/2006/main" xmlns:w14="http://schemas.microsoft.com/office/word/2010/wordml" xmlns:w15="http://schemas.microsoft.com/office/word/2012/wordml" xmlns:w16cex="http://schemas.microsoft.com/office/word/2018/wordml/cex" xmlns:w16cid="http://schemas.microsoft.com/office/word/2016/wordml/cid" xmlns:w16="http://schemas.microsoft.com/office/word/2018/wordml" xmlns:w16du="http://schemas.microsoft.com/office/word/2023/wordml/word16du" xmlns:w16sdtdh="http://schemas.microsoft.com/office/word/2020/wordml/sdtdatahash" xmlns:w16sdtfl="http://schemas.microsoft.com/office/word/2024/wordml/sdtformatlock" xmlns:w16se="http://schemas.microsoft.com/office/word/2015/wordml/symex" xmlns:wpg="http://schemas.microsoft.com/office/word/2010/wordprocessingGroup" xmlns:wpi="http://schemas.microsoft.com/office/word/2010/wordprocessingInk" xmlns:wne="http://schemas.microsoft.com/office/word/2006/wordml" xmlns:wps="http://schemas.microsoft.com/office/word/2010/wordprocessingShape" mc:Ignorable="w14 w15 w16se w16cid w16 w16cex w16sdtdh w16sdtfl w16du wp14">
   <w:body>
     <w:p>
-      <w:pPr>
-        <w:rPr>
-          <w:lang w:val="en-IL"/>
-        </w:rPr>
-      </w:pPr>
       <w:r>
         <w:rPr>
           <w:rtl/>
@@ -15,9 +10,6 @@
         <w:t>בתור ארכיטקט, התשובה שלי היא</w:t>
       </w:r>
       <w:r>
-        <w:rPr>
-          <w:lang w:val="en-IL"/>
-        </w:rPr>
         <w:t xml:space="preserve">: </w:t>
       </w:r>
       <w:r>
@@ -32,7 +24,6 @@
         <w:rPr>
           <w:b/>
           <w:bCs/>
-          <w:lang w:val="en-IL"/>
         </w:rPr>
         <w:t xml:space="preserve">-SQLite </w:t>
       </w:r>
@@ -45,9 +36,6 @@
         <w:t>היא הבחירה המקצועית והנכונה יותר למבחן</w:t>
       </w:r>
       <w:r>
-        <w:rPr>
-          <w:lang w:val="en-IL"/>
-        </w:rPr>
         <w:t xml:space="preserve">, </w:t>
       </w:r>
       <w:r>
@@ -57,18 +45,10 @@
         <w:t>אבל היא דורשת נימוק ארכיטקטוני מדויק</w:t>
       </w:r>
       <w:r>
-        <w:rPr>
-          <w:lang w:val="en-IL"/>
-        </w:rPr>
         <w:t>.</w:t>
       </w:r>
     </w:p>
     <w:p>
-      <w:pPr>
-        <w:rPr>
-          <w:lang w:val="en-IL"/>
-        </w:rPr>
-      </w:pPr>
       <w:r>
         <w:rPr>
           <w:rtl/>
@@ -76,9 +56,6 @@
         <w:t>הנה הניתוח שיעזור לך להחליט איך להציג את זה</w:t>
       </w:r>
       <w:r>
-        <w:rPr>
-          <w:lang w:val="en-IL"/>
-        </w:rPr>
         <w:t>:</w:t>
       </w:r>
     </w:p>
@@ -87,14 +64,12 @@
         <w:rPr>
           <w:b/>
           <w:bCs/>
-          <w:lang w:val="en-IL"/>
-        </w:rPr>
-      </w:pPr>
-      <w:r>
-        <w:rPr>
-          <w:b/>
-          <w:bCs/>
-          <w:lang w:val="en-IL"/>
+        </w:rPr>
+      </w:pPr>
+      <w:r>
+        <w:rPr>
+          <w:b/>
+          <w:bCs/>
         </w:rPr>
         <w:t xml:space="preserve">1. </w:t>
       </w:r>
@@ -110,7 +85,6 @@
         <w:rPr>
           <w:b/>
           <w:bCs/>
-          <w:lang w:val="en-IL"/>
         </w:rPr>
         <w:t>-SQLite (</w:t>
       </w:r>
@@ -126,17 +100,11 @@
         <w:rPr>
           <w:b/>
           <w:bCs/>
-          <w:lang w:val="en-IL"/>
         </w:rPr>
         <w:t>)?</w:t>
       </w:r>
     </w:p>
     <w:p>
-      <w:pPr>
-        <w:rPr>
-          <w:lang w:val="en-IL"/>
-        </w:rPr>
-      </w:pPr>
       <w:r>
         <w:rPr>
           <w:rtl/>
@@ -144,9 +112,6 @@
         <w:t>שמירה בקבצי</w:t>
       </w:r>
       <w:r>
-        <w:rPr>
-          <w:lang w:val="en-IL"/>
-        </w:rPr>
         <w:t xml:space="preserve"> JSON </w:t>
       </w:r>
       <w:r>
@@ -156,9 +121,6 @@
         <w:t>בודדים (כפי שתיארת קודם) היא פתרון "נאיבי". בעולם ה</w:t>
       </w:r>
       <w:r>
-        <w:rPr>
-          <w:lang w:val="en-IL"/>
-        </w:rPr>
         <w:t xml:space="preserve">-Production, </w:t>
       </w:r>
       <w:r>
@@ -168,9 +130,6 @@
         <w:t>היא סובלת מבעיות שאם יאתגרו אותך עליהן בראיון, יהיה לך קשה להגן עליהן</w:t>
       </w:r>
       <w:r>
-        <w:rPr>
-          <w:lang w:val="en-IL"/>
-        </w:rPr>
         <w:t>:</w:t>
       </w:r>
     </w:p>
@@ -180,22 +139,15 @@
           <w:ilvl w:val="0"/>
           <w:numId w:val="1"/>
         </w:numPr>
-        <w:rPr>
-          <w:lang w:val="en-IL"/>
-        </w:rPr>
-      </w:pPr>
-      <w:r>
-        <w:rPr>
-          <w:b/>
-          <w:bCs/>
-          <w:lang w:val="en-IL"/>
+      </w:pPr>
+      <w:r>
+        <w:rPr>
+          <w:b/>
+          <w:bCs/>
         </w:rPr>
         <w:t>Atomic Operations:</w:t>
       </w:r>
       <w:r>
-        <w:rPr>
-          <w:lang w:val="en-IL"/>
-        </w:rPr>
         <w:t xml:space="preserve"> </w:t>
       </w:r>
       <w:r>
@@ -205,9 +157,6 @@
         <w:t>בקבצי</w:t>
       </w:r>
       <w:r>
-        <w:rPr>
-          <w:lang w:val="en-IL"/>
-        </w:rPr>
         <w:t xml:space="preserve"> JSON, </w:t>
       </w:r>
       <w:r>
@@ -217,9 +166,6 @@
         <w:t>אם ה</w:t>
       </w:r>
       <w:r>
-        <w:rPr>
-          <w:lang w:val="en-IL"/>
-        </w:rPr>
         <w:t xml:space="preserve">-Agent </w:t>
       </w:r>
       <w:r>
@@ -229,9 +175,6 @@
         <w:t>קורס באמצע כתיבת הקובץ, את עלולה להישאר עם קובץ</w:t>
       </w:r>
       <w:r>
-        <w:rPr>
-          <w:lang w:val="en-IL"/>
-        </w:rPr>
         <w:t xml:space="preserve"> JSON </w:t>
       </w:r>
       <w:r>
@@ -241,9 +184,6 @@
         <w:t>פגום</w:t>
       </w:r>
       <w:r>
-        <w:rPr>
-          <w:lang w:val="en-IL"/>
-        </w:rPr>
         <w:t xml:space="preserve"> (Corrupted) </w:t>
       </w:r>
       <w:r>
@@ -253,9 +193,6 @@
         <w:t>שאי אפשר לקרוא. ב</w:t>
       </w:r>
       <w:r>
-        <w:rPr>
-          <w:lang w:val="en-IL"/>
-        </w:rPr>
         <w:t xml:space="preserve">-SQLite </w:t>
       </w:r>
       <w:r>
@@ -268,14 +205,10 @@
         <w:rPr>
           <w:b/>
           <w:bCs/>
-          <w:lang w:val="en-IL"/>
         </w:rPr>
         <w:t>ACID</w:t>
       </w:r>
       <w:r>
-        <w:rPr>
-          <w:lang w:val="en-IL"/>
-        </w:rPr>
         <w:t xml:space="preserve"> (Atomicity, Consistency, Isolation, Durability) </w:t>
       </w:r>
       <w:r>
@@ -285,9 +218,6 @@
         <w:t>שמבטיח שהפעולה תסתיים במלואה או לא תתבצע כלל</w:t>
       </w:r>
       <w:r>
-        <w:rPr>
-          <w:lang w:val="en-IL"/>
-        </w:rPr>
         <w:t>.</w:t>
       </w:r>
     </w:p>
@@ -297,22 +227,15 @@
           <w:ilvl w:val="0"/>
           <w:numId w:val="1"/>
         </w:numPr>
-        <w:rPr>
-          <w:lang w:val="en-IL"/>
-        </w:rPr>
-      </w:pPr>
-      <w:r>
-        <w:rPr>
-          <w:b/>
-          <w:bCs/>
-          <w:lang w:val="en-IL"/>
+      </w:pPr>
+      <w:r>
+        <w:rPr>
+          <w:b/>
+          <w:bCs/>
         </w:rPr>
         <w:t>Querying &amp; Maintenance:</w:t>
       </w:r>
       <w:r>
-        <w:rPr>
-          <w:lang w:val="en-IL"/>
-        </w:rPr>
         <w:t xml:space="preserve"> </w:t>
       </w:r>
       <w:r>
@@ -322,9 +245,6 @@
         <w:t>מה קורה כשצריך לשלוף את ה"אירוע הכי ישן" או למחוק אירועים ששוגרו בהצלחה? ב</w:t>
       </w:r>
       <w:r>
-        <w:rPr>
-          <w:lang w:val="en-IL"/>
-        </w:rPr>
         <w:t xml:space="preserve">-JSON </w:t>
       </w:r>
       <w:r>
@@ -334,9 +254,6 @@
         <w:t>עליך לסרוק את כל התיקייה ולפתוח קבצים אחד-אחד. ב</w:t>
       </w:r>
       <w:r>
-        <w:rPr>
-          <w:lang w:val="en-IL"/>
-        </w:rPr>
         <w:t xml:space="preserve">-SQLite </w:t>
       </w:r>
       <w:r>
@@ -346,9 +263,6 @@
         <w:t xml:space="preserve">את מבצעת </w:t>
       </w:r>
       <w:r>
-        <w:rPr>
-          <w:lang w:val="en-IL"/>
-        </w:rPr>
         <w:t xml:space="preserve">DELETE FROM Queue WHERE Id = ... </w:t>
       </w:r>
       <w:r>
@@ -358,9 +272,6 @@
         <w:t>וזהו. זה מהיר, בטוח ויעיל</w:t>
       </w:r>
       <w:r>
-        <w:rPr>
-          <w:lang w:val="en-IL"/>
-        </w:rPr>
         <w:t>.</w:t>
       </w:r>
     </w:p>
@@ -370,22 +281,15 @@
           <w:ilvl w:val="0"/>
           <w:numId w:val="1"/>
         </w:numPr>
-        <w:rPr>
-          <w:lang w:val="en-IL"/>
-        </w:rPr>
-      </w:pPr>
-      <w:r>
-        <w:rPr>
-          <w:b/>
-          <w:bCs/>
-          <w:lang w:val="en-IL"/>
+      </w:pPr>
+      <w:r>
+        <w:rPr>
+          <w:b/>
+          <w:bCs/>
         </w:rPr>
         <w:t>Concurrency:</w:t>
       </w:r>
       <w:r>
-        <w:rPr>
-          <w:lang w:val="en-IL"/>
-        </w:rPr>
         <w:t xml:space="preserve"> </w:t>
       </w:r>
       <w:r>
@@ -395,21 +299,23 @@
         <w:t>אם ה</w:t>
       </w:r>
       <w:r>
-        <w:rPr>
-          <w:lang w:val="en-IL"/>
-        </w:rPr>
         <w:t xml:space="preserve">-Agent </w:t>
       </w:r>
       <w:r>
         <w:rPr>
           <w:rtl/>
         </w:rPr>
-        <w:t>ירצה להתרחב בעתיד לתמיכה בריבוי תהליכונים</w:t>
-      </w:r>
-      <w:r>
-        <w:rPr>
-          <w:lang w:val="en-IL"/>
-        </w:rPr>
+        <w:t xml:space="preserve">ירצה להתרחב בעתיד לתמיכה בריבוי </w:t>
+      </w:r>
+      <w:proofErr w:type="spellStart"/>
+      <w:r>
+        <w:rPr>
+          <w:rtl/>
+        </w:rPr>
+        <w:t>תהליכונים</w:t>
+      </w:r>
+      <w:proofErr w:type="spellEnd"/>
+      <w:r>
         <w:t xml:space="preserve"> (Threads) </w:t>
       </w:r>
       <w:r>
@@ -419,9 +325,6 @@
         <w:t>שכותבים וקוראים בו-זמנית</w:t>
       </w:r>
       <w:r>
-        <w:rPr>
-          <w:lang w:val="en-IL"/>
-        </w:rPr>
         <w:t xml:space="preserve">, SQLite </w:t>
       </w:r>
       <w:r>
@@ -431,9 +334,6 @@
         <w:t>מנהל את ה</w:t>
       </w:r>
       <w:r>
-        <w:rPr>
-          <w:lang w:val="en-IL"/>
-        </w:rPr>
         <w:t xml:space="preserve">-Locking </w:t>
       </w:r>
       <w:r>
@@ -443,9 +343,6 @@
         <w:t>בצורה מובנית</w:t>
       </w:r>
       <w:r>
-        <w:rPr>
-          <w:lang w:val="en-IL"/>
-        </w:rPr>
         <w:t>.</w:t>
       </w:r>
     </w:p>
@@ -454,14 +351,12 @@
         <w:rPr>
           <w:b/>
           <w:bCs/>
-          <w:lang w:val="en-IL"/>
-        </w:rPr>
-      </w:pPr>
-      <w:r>
-        <w:rPr>
-          <w:b/>
-          <w:bCs/>
-          <w:lang w:val="en-IL"/>
+        </w:rPr>
+      </w:pPr>
+      <w:r>
+        <w:rPr>
+          <w:b/>
+          <w:bCs/>
         </w:rPr>
         <w:t xml:space="preserve">2. </w:t>
       </w:r>
@@ -475,11 +370,6 @@
       </w:r>
     </w:p>
     <w:p>
-      <w:pPr>
-        <w:rPr>
-          <w:lang w:val="en-IL"/>
-        </w:rPr>
-      </w:pPr>
       <w:r>
         <w:rPr>
           <w:rtl/>
@@ -487,9 +377,6 @@
         <w:t>אם את חוששת ש</w:t>
       </w:r>
       <w:r>
-        <w:rPr>
-          <w:lang w:val="en-IL"/>
-        </w:rPr>
         <w:t>-SQLite "</w:t>
       </w:r>
       <w:r>
@@ -499,9 +386,6 @@
         <w:t>כבד" מדי או דורש יותר מדי זמן פיתוח למבחן של שבוע</w:t>
       </w:r>
       <w:r>
-        <w:rPr>
-          <w:lang w:val="en-IL"/>
-        </w:rPr>
         <w:t>:</w:t>
       </w:r>
     </w:p>
@@ -511,9 +395,6 @@
           <w:ilvl w:val="0"/>
           <w:numId w:val="2"/>
         </w:numPr>
-        <w:rPr>
-          <w:lang w:val="en-IL"/>
-        </w:rPr>
       </w:pPr>
       <w:r>
         <w:rPr>
@@ -527,14 +408,10 @@
         <w:rPr>
           <w:b/>
           <w:bCs/>
-          <w:lang w:val="en-IL"/>
         </w:rPr>
         <w:t>:</w:t>
       </w:r>
       <w:r>
-        <w:rPr>
-          <w:lang w:val="en-IL"/>
-        </w:rPr>
         <w:t xml:space="preserve"> </w:t>
       </w:r>
       <w:r>
@@ -544,23 +421,18 @@
         <w:t>תשתמשי ב</w:t>
       </w:r>
       <w:r>
-        <w:rPr>
-          <w:lang w:val="en-IL"/>
-        </w:rPr>
         <w:t>-</w:t>
       </w:r>
-      <w:r>
-        <w:rPr>
-          <w:b/>
-          <w:bCs/>
-          <w:lang w:val="en-IL"/>
+      <w:proofErr w:type="spellStart"/>
+      <w:r>
+        <w:rPr>
+          <w:b/>
+          <w:bCs/>
         </w:rPr>
         <w:t>LiteDB</w:t>
       </w:r>
-      <w:r>
-        <w:rPr>
-          <w:lang w:val="en-IL"/>
-        </w:rPr>
+      <w:proofErr w:type="spellEnd"/>
+      <w:r>
         <w:t>.</w:t>
       </w:r>
     </w:p>
@@ -570,9 +442,6 @@
           <w:ilvl w:val="0"/>
           <w:numId w:val="2"/>
         </w:numPr>
-        <w:rPr>
-          <w:lang w:val="en-IL"/>
-        </w:rPr>
       </w:pPr>
       <w:r>
         <w:rPr>
@@ -586,16 +455,28 @@
         <w:rPr>
           <w:b/>
           <w:bCs/>
-          <w:lang w:val="en-IL"/>
-        </w:rPr>
-        <w:t xml:space="preserve"> LiteDB?</w:t>
-      </w:r>
-      <w:r>
-        <w:rPr>
-          <w:lang w:val="en-IL"/>
         </w:rPr>
         <w:t xml:space="preserve"> </w:t>
       </w:r>
+      <w:proofErr w:type="spellStart"/>
+      <w:r>
+        <w:rPr>
+          <w:b/>
+          <w:bCs/>
+        </w:rPr>
+        <w:t>LiteDB</w:t>
+      </w:r>
+      <w:proofErr w:type="spellEnd"/>
+      <w:r>
+        <w:rPr>
+          <w:b/>
+          <w:bCs/>
+        </w:rPr>
+        <w:t>?</w:t>
+      </w:r>
+      <w:r>
+        <w:t xml:space="preserve"> </w:t>
+      </w:r>
       <w:r>
         <w:rPr>
           <w:rtl/>
@@ -603,9 +484,6 @@
         <w:t>זה מסד נתונים</w:t>
       </w:r>
       <w:r>
-        <w:rPr>
-          <w:lang w:val="en-IL"/>
-        </w:rPr>
         <w:t xml:space="preserve"> NoSQL </w:t>
       </w:r>
       <w:r>
@@ -615,9 +493,6 @@
         <w:t>קטן, קובץ יחיד, שנכתב ב</w:t>
       </w:r>
       <w:r>
-        <w:rPr>
-          <w:lang w:val="en-IL"/>
-        </w:rPr>
         <w:t xml:space="preserve">-C# (.NET). </w:t>
       </w:r>
       <w:r>
@@ -627,9 +502,6 @@
         <w:t>הוא מתנהג בדיוק כמו</w:t>
       </w:r>
       <w:r>
-        <w:rPr>
-          <w:lang w:val="en-IL"/>
-        </w:rPr>
         <w:t xml:space="preserve"> JSON </w:t>
       </w:r>
       <w:r>
@@ -639,9 +511,6 @@
         <w:t>אבל עם היתרונות של מסד נתונים. הוא נחשב ל</w:t>
       </w:r>
       <w:r>
-        <w:rPr>
-          <w:lang w:val="en-IL"/>
-        </w:rPr>
         <w:t xml:space="preserve">-"Embedded Document Store" </w:t>
       </w:r>
       <w:r>
@@ -651,9 +520,6 @@
         <w:t>המושלם לצרכים שלך</w:t>
       </w:r>
       <w:r>
-        <w:rPr>
-          <w:lang w:val="en-IL"/>
-        </w:rPr>
         <w:t>.</w:t>
       </w:r>
     </w:p>
@@ -662,14 +528,12 @@
         <w:rPr>
           <w:b/>
           <w:bCs/>
-          <w:lang w:val="en-IL"/>
-        </w:rPr>
-      </w:pPr>
-      <w:r>
-        <w:rPr>
-          <w:b/>
-          <w:bCs/>
-          <w:lang w:val="en-IL"/>
+        </w:rPr>
+      </w:pPr>
+      <w:r>
+        <w:rPr>
+          <w:b/>
+          <w:bCs/>
         </w:rPr>
         <w:t xml:space="preserve">3. </w:t>
       </w:r>
@@ -685,7 +549,6 @@
         <w:rPr>
           <w:b/>
           <w:bCs/>
-          <w:lang w:val="en-IL"/>
         </w:rPr>
         <w:t xml:space="preserve"> (</w:t>
       </w:r>
@@ -701,7 +564,6 @@
         <w:rPr>
           <w:b/>
           <w:bCs/>
-          <w:lang w:val="en-IL"/>
         </w:rPr>
         <w:t xml:space="preserve">-"Pitch" </w:t>
       </w:r>
@@ -717,17 +579,11 @@
         <w:rPr>
           <w:b/>
           <w:bCs/>
-          <w:lang w:val="en-IL"/>
         </w:rPr>
         <w:t>)</w:t>
       </w:r>
     </w:p>
     <w:p>
-      <w:pPr>
-        <w:rPr>
-          <w:lang w:val="en-IL"/>
-        </w:rPr>
-      </w:pPr>
       <w:r>
         <w:rPr>
           <w:rtl/>
@@ -735,22 +591,11 @@
         <w:t>כששואלים אותך על ההחלטה, תגידי את זה כך</w:t>
       </w:r>
       <w:r>
-        <w:rPr>
-          <w:lang w:val="en-IL"/>
-        </w:rPr>
         <w:t>:</w:t>
       </w:r>
     </w:p>
     <w:p>
-      <w:pPr>
-        <w:rPr>
-          <w:lang w:val="en-IL"/>
-        </w:rPr>
-      </w:pPr>
-      <w:r>
-        <w:rPr>
-          <w:lang w:val="en-IL"/>
-        </w:rPr>
+      <w:r>
         <w:t>"</w:t>
       </w:r>
       <w:r>
@@ -760,9 +605,6 @@
         <w:t>בתחילה שקלתי שימוש בקבצי</w:t>
       </w:r>
       <w:r>
-        <w:rPr>
-          <w:lang w:val="en-IL"/>
-        </w:rPr>
         <w:t xml:space="preserve"> JSON </w:t>
       </w:r>
       <w:r>
@@ -775,14 +617,10 @@
         <w:rPr>
           <w:b/>
           <w:bCs/>
-          <w:lang w:val="en-IL"/>
         </w:rPr>
         <w:t>Production Readiness</w:t>
       </w:r>
       <w:r>
-        <w:rPr>
-          <w:lang w:val="en-IL"/>
-        </w:rPr>
         <w:t xml:space="preserve">, </w:t>
       </w:r>
       <w:r>
@@ -792,32 +630,29 @@
         <w:t>בחרתי ב</w:t>
       </w:r>
       <w:r>
-        <w:rPr>
-          <w:lang w:val="en-IL"/>
-        </w:rPr>
         <w:t>-</w:t>
       </w:r>
       <w:r>
         <w:rPr>
           <w:b/>
           <w:bCs/>
-          <w:lang w:val="en-IL"/>
-        </w:rPr>
-        <w:t>SQLite/LiteDB</w:t>
-      </w:r>
-      <w:r>
-        <w:rPr>
-          <w:lang w:val="en-IL"/>
-        </w:rPr>
+        </w:rPr>
+        <w:t>SQLite/</w:t>
+      </w:r>
+      <w:proofErr w:type="spellStart"/>
+      <w:r>
+        <w:rPr>
+          <w:b/>
+          <w:bCs/>
+        </w:rPr>
+        <w:t>LiteDB</w:t>
+      </w:r>
+      <w:proofErr w:type="spellEnd"/>
+      <w:r>
         <w:t>.</w:t>
       </w:r>
     </w:p>
     <w:p>
-      <w:pPr>
-        <w:rPr>
-          <w:lang w:val="en-IL"/>
-        </w:rPr>
-      </w:pPr>
       <w:r>
         <w:rPr>
           <w:rtl/>
@@ -825,9 +660,6 @@
         <w:t>ה</w:t>
       </w:r>
       <w:r>
-        <w:rPr>
-          <w:lang w:val="en-IL"/>
-        </w:rPr>
         <w:t xml:space="preserve">-Trade-off </w:t>
       </w:r>
       <w:r>
@@ -837,9 +669,6 @@
         <w:t>היה</w:t>
       </w:r>
       <w:r>
-        <w:rPr>
-          <w:lang w:val="en-IL"/>
-        </w:rPr>
         <w:t>:</w:t>
       </w:r>
     </w:p>
@@ -849,9 +678,6 @@
           <w:ilvl w:val="0"/>
           <w:numId w:val="3"/>
         </w:numPr>
-        <w:rPr>
-          <w:lang w:val="en-IL"/>
-        </w:rPr>
       </w:pPr>
       <w:r>
         <w:rPr>
@@ -865,14 +691,10 @@
         <w:rPr>
           <w:b/>
           <w:bCs/>
-          <w:lang w:val="en-IL"/>
         </w:rPr>
         <w:t>:</w:t>
       </w:r>
       <w:r>
-        <w:rPr>
-          <w:lang w:val="en-IL"/>
-        </w:rPr>
         <w:t xml:space="preserve"> </w:t>
       </w:r>
       <w:r>
@@ -882,9 +704,6 @@
         <w:t>הבטחת שלמות המידע</w:t>
       </w:r>
       <w:r>
-        <w:rPr>
-          <w:lang w:val="en-IL"/>
-        </w:rPr>
         <w:t xml:space="preserve"> (Data Integrity) </w:t>
       </w:r>
       <w:r>
@@ -894,9 +713,6 @@
         <w:t>בזכות מנגנון ה</w:t>
       </w:r>
       <w:r>
-        <w:rPr>
-          <w:lang w:val="en-IL"/>
-        </w:rPr>
         <w:t xml:space="preserve">-ACID, </w:t>
       </w:r>
       <w:r>
@@ -906,9 +722,6 @@
         <w:t>ויכולת שליפה וניהול אירועים יעילה ללא צורך בסריקת מערכת הקבצים</w:t>
       </w:r>
       <w:r>
-        <w:rPr>
-          <w:lang w:val="en-IL"/>
-        </w:rPr>
         <w:t>.</w:t>
       </w:r>
     </w:p>
@@ -918,9 +731,6 @@
           <w:ilvl w:val="0"/>
           <w:numId w:val="3"/>
         </w:numPr>
-        <w:rPr>
-          <w:lang w:val="en-IL"/>
-        </w:rPr>
       </w:pPr>
       <w:r>
         <w:rPr>
@@ -934,14 +744,10 @@
         <w:rPr>
           <w:b/>
           <w:bCs/>
-          <w:lang w:val="en-IL"/>
         </w:rPr>
         <w:t>:</w:t>
       </w:r>
       <w:r>
-        <w:rPr>
-          <w:lang w:val="en-IL"/>
-        </w:rPr>
         <w:t xml:space="preserve"> </w:t>
       </w:r>
       <w:r>
@@ -951,9 +757,6 @@
         <w:t>תלות בספריה חיצונית</w:t>
       </w:r>
       <w:r>
-        <w:rPr>
-          <w:lang w:val="en-IL"/>
-        </w:rPr>
         <w:t xml:space="preserve"> (Dependency), </w:t>
       </w:r>
       <w:r>
@@ -963,9 +766,6 @@
         <w:t>אך בחרתי בה כי היא קלה מאוד</w:t>
       </w:r>
       <w:r>
-        <w:rPr>
-          <w:lang w:val="en-IL"/>
-        </w:rPr>
         <w:t xml:space="preserve"> (Embedded) </w:t>
       </w:r>
       <w:r>
@@ -975,9 +775,6 @@
         <w:t>ומונעת באגים קריטיים של קבצים פגומים</w:t>
       </w:r>
       <w:r>
-        <w:rPr>
-          <w:lang w:val="en-IL"/>
-        </w:rPr>
         <w:t xml:space="preserve"> (Corruption), </w:t>
       </w:r>
       <w:r>
@@ -987,21 +784,17 @@
         <w:t>מה שחוסך לי הרבה יותר זמן בתחזוקה עתידית מאשר לו הייתי צריכה לכתוב את מנגנון ה</w:t>
       </w:r>
       <w:r>
-        <w:rPr>
-          <w:lang w:val="en-IL"/>
-        </w:rPr>
         <w:t xml:space="preserve">-Locking </w:t>
       </w:r>
+      <w:proofErr w:type="spellStart"/>
       <w:r>
         <w:rPr>
           <w:rtl/>
         </w:rPr>
         <w:t>וה</w:t>
       </w:r>
-      <w:r>
-        <w:rPr>
-          <w:lang w:val="en-IL"/>
-        </w:rPr>
+      <w:proofErr w:type="spellEnd"/>
+      <w:r>
         <w:t xml:space="preserve">-Rollback </w:t>
       </w:r>
       <w:r>
@@ -1011,9 +804,6 @@
         <w:t>בעצמי על קבצי טקסט</w:t>
       </w:r>
       <w:r>
-        <w:rPr>
-          <w:lang w:val="en-IL"/>
-        </w:rPr>
         <w:t>."</w:t>
       </w:r>
     </w:p>
@@ -1022,7 +812,6 @@
         <w:rPr>
           <w:b/>
           <w:bCs/>
-          <w:lang w:val="en-IL"/>
         </w:rPr>
       </w:pPr>
       <w:r>
@@ -1037,7 +826,6 @@
         <w:rPr>
           <w:b/>
           <w:bCs/>
-          <w:lang w:val="en-IL"/>
         </w:rPr>
         <w:t>?</w:t>
       </w:r>
@@ -1048,9 +836,6 @@
           <w:ilvl w:val="0"/>
           <w:numId w:val="4"/>
         </w:numPr>
-        <w:rPr>
-          <w:lang w:val="en-IL"/>
-        </w:rPr>
       </w:pPr>
       <w:r>
         <w:rPr>
@@ -1065,14 +850,10 @@
         <w:rPr>
           <w:b/>
           <w:bCs/>
-          <w:lang w:val="en-IL"/>
         </w:rPr>
         <w:t>:</w:t>
       </w:r>
       <w:r>
-        <w:rPr>
-          <w:lang w:val="en-IL"/>
-        </w:rPr>
         <w:t xml:space="preserve"> </w:t>
       </w:r>
       <w:r>
@@ -1082,23 +863,16 @@
         <w:t>תממשי ב</w:t>
       </w:r>
       <w:r>
-        <w:rPr>
-          <w:lang w:val="en-IL"/>
-        </w:rPr>
         <w:t>-</w:t>
       </w:r>
       <w:r>
         <w:rPr>
           <w:b/>
           <w:bCs/>
-          <w:lang w:val="en-IL"/>
         </w:rPr>
         <w:t>SQLite</w:t>
       </w:r>
       <w:r>
-        <w:rPr>
-          <w:lang w:val="en-IL"/>
-        </w:rPr>
         <w:t xml:space="preserve"> (</w:t>
       </w:r>
       <w:r>
@@ -1108,9 +882,6 @@
         <w:t>דרך</w:t>
       </w:r>
       <w:r>
-        <w:rPr>
-          <w:lang w:val="en-IL"/>
-        </w:rPr>
         <w:t xml:space="preserve"> Entity Framework Core </w:t>
       </w:r>
       <w:r>
@@ -1120,9 +891,6 @@
         <w:t>או</w:t>
       </w:r>
       <w:r>
-        <w:rPr>
-          <w:lang w:val="en-IL"/>
-        </w:rPr>
         <w:t xml:space="preserve"> Dapper). </w:t>
       </w:r>
       <w:r>
@@ -1132,9 +900,6 @@
         <w:t>זה יראה שאת מכירה כלים של</w:t>
       </w:r>
       <w:r>
-        <w:rPr>
-          <w:lang w:val="en-IL"/>
-        </w:rPr>
         <w:t xml:space="preserve"> Enterprise.</w:t>
       </w:r>
     </w:p>
@@ -1144,9 +909,6 @@
           <w:ilvl w:val="0"/>
           <w:numId w:val="4"/>
         </w:numPr>
-        <w:rPr>
-          <w:lang w:val="en-IL"/>
-        </w:rPr>
       </w:pPr>
       <w:r>
         <w:rPr>
@@ -1160,14 +922,10 @@
         <w:rPr>
           <w:b/>
           <w:bCs/>
-          <w:lang w:val="en-IL"/>
         </w:rPr>
         <w:t>:</w:t>
       </w:r>
       <w:r>
-        <w:rPr>
-          <w:lang w:val="en-IL"/>
-        </w:rPr>
         <w:t xml:space="preserve"> </w:t>
       </w:r>
       <w:r>
@@ -1177,23 +935,18 @@
         <w:t>תממשי ב</w:t>
       </w:r>
       <w:r>
-        <w:rPr>
-          <w:lang w:val="en-IL"/>
-        </w:rPr>
         <w:t>-</w:t>
       </w:r>
-      <w:r>
-        <w:rPr>
-          <w:b/>
-          <w:bCs/>
-          <w:lang w:val="en-IL"/>
+      <w:proofErr w:type="spellStart"/>
+      <w:r>
+        <w:rPr>
+          <w:b/>
+          <w:bCs/>
         </w:rPr>
         <w:t>LiteDB</w:t>
       </w:r>
-      <w:r>
-        <w:rPr>
-          <w:lang w:val="en-IL"/>
-        </w:rPr>
+      <w:proofErr w:type="spellEnd"/>
+      <w:r>
         <w:t xml:space="preserve">. </w:t>
       </w:r>
       <w:r>
@@ -1203,31 +956,40 @@
         <w:t>זה יראה שאת חכמה מספיק כדי לבחור כלי שנותן לך "כוח" של מסד נתונים עם "פשטות" של קבצים</w:t>
       </w:r>
       <w:r>
-        <w:rPr>
-          <w:lang w:val="en-IL"/>
-        </w:rPr>
         <w:t>.</w:t>
       </w:r>
     </w:p>
     <w:p>
-      <w:pPr>
-        <w:rPr>
-          <w:lang w:val="en-IL"/>
-        </w:rPr>
-      </w:pPr>
-      <w:r>
-        <w:rPr>
-          <w:b/>
-          <w:bCs/>
-          <w:rtl/>
-        </w:rPr>
-        <w:t>בכל מקרה – אל תשארי עם קבצי</w:t>
-      </w:r>
-      <w:r>
-        <w:rPr>
-          <w:b/>
-          <w:bCs/>
-          <w:lang w:val="en-IL"/>
+      <w:r>
+        <w:rPr>
+          <w:b/>
+          <w:bCs/>
+          <w:rtl/>
+        </w:rPr>
+        <w:t xml:space="preserve">בכל מקרה – אל </w:t>
+      </w:r>
+      <w:proofErr w:type="spellStart"/>
+      <w:r>
+        <w:rPr>
+          <w:b/>
+          <w:bCs/>
+          <w:rtl/>
+        </w:rPr>
+        <w:t>תשארי</w:t>
+      </w:r>
+      <w:proofErr w:type="spellEnd"/>
+      <w:r>
+        <w:rPr>
+          <w:b/>
+          <w:bCs/>
+          <w:rtl/>
+        </w:rPr>
+        <w:t xml:space="preserve"> עם קבצי</w:t>
+      </w:r>
+      <w:r>
+        <w:rPr>
+          <w:b/>
+          <w:bCs/>
         </w:rPr>
         <w:t xml:space="preserve"> JSON </w:t>
       </w:r>
@@ -1241,6 +1003,690 @@
       </w:r>
     </w:p>
     <w:p/>
+    <w:p>
+      <w:r>
+        <w:br w:type="page"/>
+      </w:r>
+    </w:p>
+    <w:p>
+      <w:pPr>
+        <w:rPr>
+          <w:rtl/>
+        </w:rPr>
+      </w:pPr>
+      <w:r>
+        <w:lastRenderedPageBreak/>
+        <w:t>[External Sources] ──&gt; [API/Ingest] ──&gt; [</w:t>
+      </w:r>
+      <w:proofErr w:type="spellStart"/>
+      <w:r>
+        <w:t>EventChannel</w:t>
+      </w:r>
+      <w:proofErr w:type="spellEnd"/>
+      <w:r>
+        <w:t>] │ ┌─────────────────────</w:t>
+      </w:r>
+      <w:r>
+        <w:rPr>
+          <w:rFonts w:ascii="MS Gothic" w:eastAsia="MS Gothic" w:hAnsi="MS Gothic" w:cs="MS Gothic" w:hint="eastAsia"/>
+        </w:rPr>
+        <w:t>┴</w:t>
+      </w:r>
+      <w:r>
+        <w:rPr>
+          <w:rFonts w:ascii="Aptos" w:hAnsi="Aptos" w:cs="Aptos"/>
+        </w:rPr>
+        <w:t>─────────────────────┐</w:t>
+      </w:r>
+      <w:r>
+        <w:t xml:space="preserve"> </w:t>
+      </w:r>
+      <w:r>
+        <w:rPr>
+          <w:rFonts w:ascii="Arial" w:hAnsi="Arial" w:cs="Arial"/>
+        </w:rPr>
+        <w:t>▼</w:t>
+      </w:r>
+      <w:r>
+        <w:t xml:space="preserve"> (Write-Ahead Fast) </w:t>
+      </w:r>
+      <w:r>
+        <w:rPr>
+          <w:rFonts w:ascii="Arial" w:hAnsi="Arial" w:cs="Arial"/>
+        </w:rPr>
+        <w:t>▼</w:t>
+      </w:r>
+      <w:r>
+        <w:t xml:space="preserve"> (In-Memory Queue) [SQLite Persistence] [</w:t>
+      </w:r>
+      <w:proofErr w:type="spellStart"/>
+      <w:proofErr w:type="gramStart"/>
+      <w:r>
+        <w:t>System.Threading.Channels</w:t>
+      </w:r>
+      <w:proofErr w:type="spellEnd"/>
+      <w:proofErr w:type="gramEnd"/>
+      <w:r>
+        <w:t xml:space="preserve">] (Status: Pending) </w:t>
+      </w:r>
+      <w:r>
+        <w:rPr>
+          <w:rFonts w:ascii="Aptos" w:hAnsi="Aptos" w:cs="Aptos"/>
+        </w:rPr>
+        <w:t>│</w:t>
+      </w:r>
+      <w:r>
+        <w:t xml:space="preserve"> </w:t>
+      </w:r>
+      <w:r>
+        <w:rPr>
+          <w:rFonts w:ascii="Arial" w:hAnsi="Arial" w:cs="Arial"/>
+        </w:rPr>
+        <w:t>▼</w:t>
+      </w:r>
+      <w:r>
+        <w:t xml:space="preserve"> [Background Worker] </w:t>
+      </w:r>
+      <w:r>
+        <w:rPr>
+          <w:rFonts w:ascii="Aptos" w:hAnsi="Aptos" w:cs="Aptos"/>
+        </w:rPr>
+        <w:t>│</w:t>
+      </w:r>
+      <w:r>
+        <w:t xml:space="preserve"> (Confirm / Poison) </w:t>
+      </w:r>
+      <w:r>
+        <w:rPr>
+          <w:rFonts w:ascii="Arial" w:hAnsi="Arial" w:cs="Arial"/>
+        </w:rPr>
+        <w:t>◄</w:t>
+      </w:r>
+      <w:r>
+        <w:rPr>
+          <w:rFonts w:ascii="Aptos" w:hAnsi="Aptos" w:cs="Aptos"/>
+        </w:rPr>
+        <w:t>─────────</w:t>
+      </w:r>
+      <w:r>
+        <w:rPr>
+          <w:rFonts w:ascii="MS Gothic" w:eastAsia="MS Gothic" w:hAnsi="MS Gothic" w:cs="MS Gothic" w:hint="eastAsia"/>
+        </w:rPr>
+        <w:t>┤</w:t>
+      </w:r>
+      <w:r>
+        <w:t xml:space="preserve"> [Update SQLite Row] </w:t>
+      </w:r>
+      <w:r>
+        <w:rPr>
+          <w:rFonts w:ascii="Arial" w:hAnsi="Arial" w:cs="Arial"/>
+        </w:rPr>
+        <w:t>◄</w:t>
+      </w:r>
+      <w:r>
+        <w:rPr>
+          <w:rFonts w:ascii="Aptos" w:hAnsi="Aptos" w:cs="Aptos"/>
+        </w:rPr>
+        <w:t>────────┘</w:t>
+      </w:r>
+    </w:p>
+    <w:p>
+      <w:pPr>
+        <w:rPr>
+          <w:rtl/>
+        </w:rPr>
+      </w:pPr>
+    </w:p>
+    <w:p>
+      <w:pPr>
+        <w:rPr>
+          <w:rtl/>
+        </w:rPr>
+      </w:pPr>
+      <w:r>
+        <w:drawing>
+          <wp:inline distT="0" distB="0" distL="0" distR="0" wp14:anchorId="1B89C1BD" wp14:editId="0C38EB23">
+            <wp:extent cx="5731510" cy="2280285"/>
+            <wp:effectExtent l="0" t="0" r="2540" b="5715"/>
+            <wp:docPr id="2146235317" name="Picture 1"/>
+            <wp:cNvGraphicFramePr>
+              <a:graphicFrameLocks xmlns:a="http://schemas.openxmlformats.org/drawingml/2006/main" noChangeAspect="1"/>
+            </wp:cNvGraphicFramePr>
+            <a:graphic xmlns:a="http://schemas.openxmlformats.org/drawingml/2006/main">
+              <a:graphicData uri="http://schemas.openxmlformats.org/drawingml/2006/picture">
+                <pic:pic xmlns:pic="http://schemas.openxmlformats.org/drawingml/2006/picture">
+                  <pic:nvPicPr>
+                    <pic:cNvPr id="2146235317" name=""/>
+                    <pic:cNvPicPr/>
+                  </pic:nvPicPr>
+                  <pic:blipFill>
+                    <a:blip r:embed="rId5"/>
+                    <a:stretch>
+                      <a:fillRect/>
+                    </a:stretch>
+                  </pic:blipFill>
+                  <pic:spPr>
+                    <a:xfrm>
+                      <a:off x="0" y="0"/>
+                      <a:ext cx="5731510" cy="2280285"/>
+                    </a:xfrm>
+                    <a:prstGeom prst="rect">
+                      <a:avLst/>
+                    </a:prstGeom>
+                  </pic:spPr>
+                </pic:pic>
+              </a:graphicData>
+            </a:graphic>
+          </wp:inline>
+        </w:drawing>
+      </w:r>
+    </w:p>
+    <w:p>
+      <w:pPr>
+        <w:rPr>
+          <w:rtl/>
+        </w:rPr>
+      </w:pPr>
+    </w:p>
+    <w:p>
+      <w:pPr>
+        <w:rPr>
+          <w:lang w:val="en-IL"/>
+        </w:rPr>
+      </w:pPr>
+    </w:p>
+    <w:p>
+      <w:pPr>
+        <w:rPr>
+          <w:lang w:val="en-IL"/>
+        </w:rPr>
+      </w:pPr>
+      <w:r>
+        <w:rPr>
+          <w:lang w:val="en-IL"/>
+        </w:rPr>
+        <w:br w:type="page"/>
+      </w:r>
+    </w:p>
+    <w:p>
+      <w:pPr>
+        <w:bidi/>
+        <w:rPr>
+          <w:b/>
+          <w:bCs/>
+          <w:lang w:val="en-IL"/>
+        </w:rPr>
+      </w:pPr>
+      <w:proofErr w:type="spellStart"/>
+      <w:r>
+        <w:rPr>
+          <w:b/>
+          <w:bCs/>
+          <w:rtl/>
+          <w:lang w:val="en-IL"/>
+        </w:rPr>
+        <w:lastRenderedPageBreak/>
+        <w:t>קודות</w:t>
+      </w:r>
+      <w:proofErr w:type="spellEnd"/>
+      <w:r>
+        <w:rPr>
+          <w:b/>
+          <w:bCs/>
+          <w:rtl/>
+          <w:lang w:val="en-IL"/>
+        </w:rPr>
+        <w:t xml:space="preserve"> מפתח שיעזרו לך להוביל את ה</w:t>
+      </w:r>
+      <w:r>
+        <w:rPr>
+          <w:b/>
+          <w:bCs/>
+          <w:lang w:val="en-IL"/>
+        </w:rPr>
+        <w:t>-Code Review:</w:t>
+      </w:r>
+    </w:p>
+    <w:p>
+      <w:pPr>
+        <w:numPr>
+          <w:ilvl w:val="0"/>
+          <w:numId w:val="5"/>
+        </w:numPr>
+        <w:bidi/>
+        <w:rPr>
+          <w:lang w:val="en-IL"/>
+        </w:rPr>
+      </w:pPr>
+      <w:r>
+        <w:rPr>
+          <w:b/>
+          <w:bCs/>
+          <w:lang w:val="en-IL"/>
+        </w:rPr>
+        <w:t>WAL Mode (Write-Ahead Logging):</w:t>
+      </w:r>
+      <w:r>
+        <w:rPr>
+          <w:lang w:val="en-IL"/>
+        </w:rPr>
+        <w:t xml:space="preserve"> </w:t>
+      </w:r>
+      <w:r>
+        <w:rPr>
+          <w:rtl/>
+          <w:lang w:val="en-IL"/>
+        </w:rPr>
+        <w:t>כשישאלו אותך למה</w:t>
+      </w:r>
+      <w:r>
+        <w:rPr>
+          <w:lang w:val="en-IL"/>
+        </w:rPr>
+        <w:t xml:space="preserve"> SQLite </w:t>
+      </w:r>
+      <w:r>
+        <w:rPr>
+          <w:rtl/>
+          <w:lang w:val="en-IL"/>
+        </w:rPr>
+        <w:t>מהיר יותר מכתיבת קבצים, תסבירי שבהפעלת</w:t>
+      </w:r>
+      <w:r>
+        <w:rPr>
+          <w:lang w:val="en-IL"/>
+        </w:rPr>
+        <w:t xml:space="preserve"> WAL Mode, </w:t>
+      </w:r>
+      <w:r>
+        <w:rPr>
+          <w:rtl/>
+          <w:lang w:val="en-IL"/>
+        </w:rPr>
+        <w:t>פעולות הכתיבה נרשמות לקובץ לוג ייעודי ומבוצעות ב</w:t>
+      </w:r>
+      <w:r>
+        <w:rPr>
+          <w:lang w:val="en-IL"/>
+        </w:rPr>
+        <w:t xml:space="preserve">-Append </w:t>
+      </w:r>
+      <w:r>
+        <w:rPr>
+          <w:rtl/>
+          <w:lang w:val="en-IL"/>
+        </w:rPr>
+        <w:t>בלבד, מה שמאפשר לקוראים</w:t>
+      </w:r>
+      <w:r>
+        <w:rPr>
+          <w:lang w:val="en-IL"/>
+        </w:rPr>
+        <w:t xml:space="preserve"> (Readers) </w:t>
+      </w:r>
+      <w:r>
+        <w:rPr>
+          <w:rtl/>
+          <w:lang w:val="en-IL"/>
+        </w:rPr>
+        <w:t>וכותבים</w:t>
+      </w:r>
+      <w:r>
+        <w:rPr>
+          <w:lang w:val="en-IL"/>
+        </w:rPr>
+        <w:t xml:space="preserve"> (Writers) </w:t>
+      </w:r>
+      <w:r>
+        <w:rPr>
+          <w:rtl/>
+          <w:lang w:val="en-IL"/>
+        </w:rPr>
+        <w:t>לעבוד במקביל מבלי לחסום אחד את השני</w:t>
+      </w:r>
+      <w:r>
+        <w:rPr>
+          <w:lang w:val="en-IL"/>
+        </w:rPr>
+        <w:t>.</w:t>
+      </w:r>
+    </w:p>
+    <w:p>
+      <w:pPr>
+        <w:numPr>
+          <w:ilvl w:val="0"/>
+          <w:numId w:val="5"/>
+        </w:numPr>
+        <w:bidi/>
+        <w:rPr>
+          <w:lang w:val="en-IL"/>
+        </w:rPr>
+      </w:pPr>
+      <w:r>
+        <w:rPr>
+          <w:b/>
+          <w:bCs/>
+          <w:rtl/>
+          <w:lang w:val="en-IL"/>
+        </w:rPr>
+        <w:t>בחירה ב</w:t>
+      </w:r>
+      <w:r>
+        <w:rPr>
+          <w:b/>
+          <w:bCs/>
+          <w:lang w:val="en-IL"/>
+        </w:rPr>
+        <w:t xml:space="preserve">-Raw SQLite / Dapper </w:t>
+      </w:r>
+      <w:r>
+        <w:rPr>
+          <w:b/>
+          <w:bCs/>
+          <w:rtl/>
+          <w:lang w:val="en-IL"/>
+        </w:rPr>
+        <w:t>על פני</w:t>
+      </w:r>
+      <w:r>
+        <w:rPr>
+          <w:b/>
+          <w:bCs/>
+          <w:lang w:val="en-IL"/>
+        </w:rPr>
+        <w:t xml:space="preserve"> EF Core:</w:t>
+      </w:r>
+      <w:r>
+        <w:rPr>
+          <w:lang w:val="en-IL"/>
+        </w:rPr>
+        <w:t xml:space="preserve"> </w:t>
+      </w:r>
+      <w:r>
+        <w:rPr>
+          <w:rtl/>
+          <w:lang w:val="en-IL"/>
+        </w:rPr>
+        <w:t>ב</w:t>
+      </w:r>
+      <w:r>
+        <w:rPr>
+          <w:lang w:val="en-IL"/>
+        </w:rPr>
+        <w:t xml:space="preserve">-Agent </w:t>
+      </w:r>
+      <w:r>
+        <w:rPr>
+          <w:rtl/>
+          <w:lang w:val="en-IL"/>
+        </w:rPr>
+        <w:t>קצה</w:t>
+      </w:r>
+      <w:r>
+        <w:rPr>
+          <w:lang w:val="en-IL"/>
+        </w:rPr>
+        <w:t xml:space="preserve"> (Edge Component), </w:t>
+      </w:r>
+      <w:r>
+        <w:rPr>
+          <w:rtl/>
+          <w:lang w:val="en-IL"/>
+        </w:rPr>
+        <w:t>המטרה היא צריכת זיכרון</w:t>
+      </w:r>
+      <w:r>
+        <w:rPr>
+          <w:lang w:val="en-IL"/>
+        </w:rPr>
+        <w:t xml:space="preserve"> (RAM) </w:t>
+      </w:r>
+      <w:r>
+        <w:rPr>
+          <w:rtl/>
+          <w:lang w:val="en-IL"/>
+        </w:rPr>
+        <w:t>מינימלית ככל הניתן</w:t>
+      </w:r>
+      <w:r>
+        <w:rPr>
+          <w:lang w:val="en-IL"/>
+        </w:rPr>
+        <w:t xml:space="preserve">. EF Core </w:t>
+      </w:r>
+      <w:r>
+        <w:rPr>
+          <w:rtl/>
+          <w:lang w:val="en-IL"/>
+        </w:rPr>
+        <w:t xml:space="preserve">מביא </w:t>
+      </w:r>
+      <w:proofErr w:type="spellStart"/>
+      <w:r>
+        <w:rPr>
+          <w:rtl/>
+          <w:lang w:val="en-IL"/>
+        </w:rPr>
+        <w:t>איתו</w:t>
+      </w:r>
+      <w:proofErr w:type="spellEnd"/>
+      <w:r>
+        <w:rPr>
+          <w:rtl/>
+          <w:lang w:val="en-IL"/>
+        </w:rPr>
+        <w:t xml:space="preserve"> מנגנוני</w:t>
+      </w:r>
+      <w:r>
+        <w:rPr>
+          <w:lang w:val="en-IL"/>
+        </w:rPr>
+        <w:t xml:space="preserve"> Change Tracking </w:t>
+      </w:r>
+      <w:r>
+        <w:rPr>
+          <w:rtl/>
+          <w:lang w:val="en-IL"/>
+        </w:rPr>
+        <w:t>ו</w:t>
+      </w:r>
+      <w:r>
+        <w:rPr>
+          <w:lang w:val="en-IL"/>
+        </w:rPr>
+        <w:t xml:space="preserve">-Caching </w:t>
+      </w:r>
+      <w:r>
+        <w:rPr>
+          <w:rtl/>
+          <w:lang w:val="en-IL"/>
+        </w:rPr>
+        <w:t>כבדים שאינם נחוצים למשימה פשוטה של תור הודעות מקומי</w:t>
+      </w:r>
+      <w:r>
+        <w:rPr>
+          <w:lang w:val="en-IL"/>
+        </w:rPr>
+        <w:t>.</w:t>
+      </w:r>
+    </w:p>
+    <w:p>
+      <w:pPr>
+        <w:numPr>
+          <w:ilvl w:val="0"/>
+          <w:numId w:val="5"/>
+        </w:numPr>
+        <w:bidi/>
+        <w:rPr>
+          <w:lang w:val="en-IL"/>
+        </w:rPr>
+      </w:pPr>
+      <w:r>
+        <w:rPr>
+          <w:b/>
+          <w:bCs/>
+          <w:rtl/>
+          <w:lang w:val="en-IL"/>
+        </w:rPr>
+        <w:t>עקרון ה</w:t>
+      </w:r>
+      <w:r>
+        <w:rPr>
+          <w:b/>
+          <w:bCs/>
+          <w:lang w:val="en-IL"/>
+        </w:rPr>
+        <w:t>-Dependency Injection:</w:t>
+      </w:r>
+      <w:r>
+        <w:rPr>
+          <w:lang w:val="en-IL"/>
+        </w:rPr>
+        <w:t xml:space="preserve"> </w:t>
+      </w:r>
+      <w:r>
+        <w:rPr>
+          <w:rtl/>
+          <w:lang w:val="en-IL"/>
+        </w:rPr>
+        <w:t>ההפרדה בין הצינור בזיכרון</w:t>
+      </w:r>
+      <w:r>
+        <w:rPr>
+          <w:lang w:val="en-IL"/>
+        </w:rPr>
+        <w:t xml:space="preserve"> (</w:t>
+      </w:r>
+      <w:proofErr w:type="spellStart"/>
+      <w:r>
+        <w:rPr>
+          <w:lang w:val="en-IL"/>
+        </w:rPr>
+        <w:t>EventChannel</w:t>
+      </w:r>
+      <w:proofErr w:type="spellEnd"/>
+      <w:r>
+        <w:rPr>
+          <w:lang w:val="en-IL"/>
+        </w:rPr>
+        <w:t xml:space="preserve">) </w:t>
+      </w:r>
+      <w:r>
+        <w:rPr>
+          <w:rtl/>
+          <w:lang w:val="en-IL"/>
+        </w:rPr>
+        <w:t>לבין מנגנון שמירת הנתונים</w:t>
+      </w:r>
+      <w:r>
+        <w:rPr>
+          <w:lang w:val="en-IL"/>
+        </w:rPr>
+        <w:t xml:space="preserve"> (</w:t>
+      </w:r>
+      <w:proofErr w:type="spellStart"/>
+      <w:r>
+        <w:rPr>
+          <w:lang w:val="en-IL"/>
+        </w:rPr>
+        <w:t>ISqliteEventRepository</w:t>
+      </w:r>
+      <w:proofErr w:type="spellEnd"/>
+      <w:r>
+        <w:rPr>
+          <w:lang w:val="en-IL"/>
+        </w:rPr>
+        <w:t xml:space="preserve">) </w:t>
+      </w:r>
+      <w:r>
+        <w:rPr>
+          <w:rtl/>
+          <w:lang w:val="en-IL"/>
+        </w:rPr>
+        <w:t>מאפשרת לנו בעתיד להחליף את</w:t>
+      </w:r>
+      <w:r>
+        <w:rPr>
+          <w:lang w:val="en-IL"/>
+        </w:rPr>
+        <w:t xml:space="preserve"> SQLite </w:t>
+      </w:r>
+      <w:r>
+        <w:rPr>
+          <w:rtl/>
+          <w:lang w:val="en-IL"/>
+        </w:rPr>
+        <w:t>בכל בסיס נתונים אחר (למשל</w:t>
+      </w:r>
+      <w:r>
+        <w:rPr>
+          <w:lang w:val="en-IL"/>
+        </w:rPr>
+        <w:t xml:space="preserve"> </w:t>
+      </w:r>
+      <w:proofErr w:type="spellStart"/>
+      <w:r>
+        <w:rPr>
+          <w:lang w:val="en-IL"/>
+        </w:rPr>
+        <w:t>LiteDB</w:t>
+      </w:r>
+      <w:proofErr w:type="spellEnd"/>
+      <w:r>
+        <w:rPr>
+          <w:lang w:val="en-IL"/>
+        </w:rPr>
+        <w:t xml:space="preserve"> </w:t>
+      </w:r>
+      <w:r>
+        <w:rPr>
+          <w:rtl/>
+          <w:lang w:val="en-IL"/>
+        </w:rPr>
+        <w:t>או</w:t>
+      </w:r>
+      <w:r>
+        <w:rPr>
+          <w:lang w:val="en-IL"/>
+        </w:rPr>
+        <w:t xml:space="preserve"> </w:t>
+      </w:r>
+      <w:proofErr w:type="spellStart"/>
+      <w:r>
+        <w:rPr>
+          <w:lang w:val="en-IL"/>
+        </w:rPr>
+        <w:t>RocksDB</w:t>
+      </w:r>
+      <w:proofErr w:type="spellEnd"/>
+      <w:r>
+        <w:rPr>
+          <w:lang w:val="en-IL"/>
+        </w:rPr>
+        <w:t xml:space="preserve">) </w:t>
+      </w:r>
+      <w:r>
+        <w:rPr>
+          <w:rtl/>
+          <w:lang w:val="en-IL"/>
+        </w:rPr>
+        <w:t>מבלי לגעת בשורת קוד אחת של לוגיקת הניהול של ה</w:t>
+      </w:r>
+      <w:r>
+        <w:rPr>
+          <w:lang w:val="en-IL"/>
+        </w:rPr>
+        <w:t>-Channel.</w:t>
+      </w:r>
+    </w:p>
+    <w:p>
+      <w:pPr>
+        <w:bidi/>
+        <w:rPr>
+          <w:lang w:val="en-IL"/>
+        </w:rPr>
+      </w:pPr>
+    </w:p>
     <w:sectPr>
       <w:pgSz w:w="11906" w:h="16838"/>
       <w:pgMar w:top="1440" w:right="1440" w:bottom="1440" w:left="1440" w:header="708" w:footer="708" w:gutter="0"/>
@@ -1403,6 +1849,155 @@
     </w:lvl>
   </w:abstractNum>
   <w:abstractNum w:abstractNumId="1" w15:restartNumberingAfterBreak="0">
+    <w:nsid w:val="31787F67"/>
+    <w:multiLevelType w:val="multilevel"/>
+    <w:tmpl w:val="E8B62DC4"/>
+    <w:lvl w:ilvl="0">
+      <w:start w:val="1"/>
+      <w:numFmt w:val="bullet"/>
+      <w:lvlText w:val=""/>
+      <w:lvlJc w:val="left"/>
+      <w:pPr>
+        <w:tabs>
+          <w:tab w:val="num" w:pos="720"/>
+        </w:tabs>
+        <w:ind w:left="720" w:hanging="360"/>
+      </w:pPr>
+      <w:rPr>
+        <w:rFonts w:ascii="Symbol" w:hAnsi="Symbol" w:hint="default"/>
+        <w:sz w:val="20"/>
+      </w:rPr>
+    </w:lvl>
+    <w:lvl w:ilvl="1" w:tentative="1">
+      <w:start w:val="1"/>
+      <w:numFmt w:val="bullet"/>
+      <w:lvlText w:val="o"/>
+      <w:lvlJc w:val="left"/>
+      <w:pPr>
+        <w:tabs>
+          <w:tab w:val="num" w:pos="1440"/>
+        </w:tabs>
+        <w:ind w:left="1440" w:hanging="360"/>
+      </w:pPr>
+      <w:rPr>
+        <w:rFonts w:ascii="Courier New" w:hAnsi="Courier New" w:hint="default"/>
+        <w:sz w:val="20"/>
+      </w:rPr>
+    </w:lvl>
+    <w:lvl w:ilvl="2" w:tentative="1">
+      <w:start w:val="1"/>
+      <w:numFmt w:val="bullet"/>
+      <w:lvlText w:val=""/>
+      <w:lvlJc w:val="left"/>
+      <w:pPr>
+        <w:tabs>
+          <w:tab w:val="num" w:pos="2160"/>
+        </w:tabs>
+        <w:ind w:left="2160" w:hanging="360"/>
+      </w:pPr>
+      <w:rPr>
+        <w:rFonts w:ascii="Wingdings" w:hAnsi="Wingdings" w:hint="default"/>
+        <w:sz w:val="20"/>
+      </w:rPr>
+    </w:lvl>
+    <w:lvl w:ilvl="3" w:tentative="1">
+      <w:start w:val="1"/>
+      <w:numFmt w:val="bullet"/>
+      <w:lvlText w:val=""/>
+      <w:lvlJc w:val="left"/>
+      <w:pPr>
+        <w:tabs>
+          <w:tab w:val="num" w:pos="2880"/>
+        </w:tabs>
+        <w:ind w:left="2880" w:hanging="360"/>
+      </w:pPr>
+      <w:rPr>
+        <w:rFonts w:ascii="Wingdings" w:hAnsi="Wingdings" w:hint="default"/>
+        <w:sz w:val="20"/>
+      </w:rPr>
+    </w:lvl>
+    <w:lvl w:ilvl="4" w:tentative="1">
+      <w:start w:val="1"/>
+      <w:numFmt w:val="bullet"/>
+      <w:lvlText w:val=""/>
+      <w:lvlJc w:val="left"/>
+      <w:pPr>
+        <w:tabs>
+          <w:tab w:val="num" w:pos="3600"/>
+        </w:tabs>
+        <w:ind w:left="3600" w:hanging="360"/>
+      </w:pPr>
+      <w:rPr>
+        <w:rFonts w:ascii="Wingdings" w:hAnsi="Wingdings" w:hint="default"/>
+        <w:sz w:val="20"/>
+      </w:rPr>
+    </w:lvl>
+    <w:lvl w:ilvl="5" w:tentative="1">
+      <w:start w:val="1"/>
+      <w:numFmt w:val="bullet"/>
+      <w:lvlText w:val=""/>
+      <w:lvlJc w:val="left"/>
+      <w:pPr>
+        <w:tabs>
+          <w:tab w:val="num" w:pos="4320"/>
+        </w:tabs>
+        <w:ind w:left="4320" w:hanging="360"/>
+      </w:pPr>
+      <w:rPr>
+        <w:rFonts w:ascii="Wingdings" w:hAnsi="Wingdings" w:hint="default"/>
+        <w:sz w:val="20"/>
+      </w:rPr>
+    </w:lvl>
+    <w:lvl w:ilvl="6" w:tentative="1">
+      <w:start w:val="1"/>
+      <w:numFmt w:val="bullet"/>
+      <w:lvlText w:val=""/>
+      <w:lvlJc w:val="left"/>
+      <w:pPr>
+        <w:tabs>
+          <w:tab w:val="num" w:pos="5040"/>
+        </w:tabs>
+        <w:ind w:left="5040" w:hanging="360"/>
+      </w:pPr>
+      <w:rPr>
+        <w:rFonts w:ascii="Wingdings" w:hAnsi="Wingdings" w:hint="default"/>
+        <w:sz w:val="20"/>
+      </w:rPr>
+    </w:lvl>
+    <w:lvl w:ilvl="7" w:tentative="1">
+      <w:start w:val="1"/>
+      <w:numFmt w:val="bullet"/>
+      <w:lvlText w:val=""/>
+      <w:lvlJc w:val="left"/>
+      <w:pPr>
+        <w:tabs>
+          <w:tab w:val="num" w:pos="5760"/>
+        </w:tabs>
+        <w:ind w:left="5760" w:hanging="360"/>
+      </w:pPr>
+      <w:rPr>
+        <w:rFonts w:ascii="Wingdings" w:hAnsi="Wingdings" w:hint="default"/>
+        <w:sz w:val="20"/>
+      </w:rPr>
+    </w:lvl>
+    <w:lvl w:ilvl="8" w:tentative="1">
+      <w:start w:val="1"/>
+      <w:numFmt w:val="bullet"/>
+      <w:lvlText w:val=""/>
+      <w:lvlJc w:val="left"/>
+      <w:pPr>
+        <w:tabs>
+          <w:tab w:val="num" w:pos="6480"/>
+        </w:tabs>
+        <w:ind w:left="6480" w:hanging="360"/>
+      </w:pPr>
+      <w:rPr>
+        <w:rFonts w:ascii="Wingdings" w:hAnsi="Wingdings" w:hint="default"/>
+        <w:sz w:val="20"/>
+      </w:rPr>
+    </w:lvl>
+  </w:abstractNum>
+  <w:abstractNum w:abstractNumId="2" w15:restartNumberingAfterBreak="0">
     <w:nsid w:val="435B360F"/>
     <w:multiLevelType w:val="multilevel"/>
     <w:tmpl w:val="127A0F46"/>
@@ -1515,7 +2110,7 @@
       </w:pPr>
     </w:lvl>
   </w:abstractNum>
-  <w:abstractNum w:abstractNumId="2" w15:restartNumberingAfterBreak="0">
+  <w:abstractNum w:abstractNumId="3" w15:restartNumberingAfterBreak="0">
     <w:nsid w:val="58271D7D"/>
     <w:multiLevelType w:val="multilevel"/>
     <w:tmpl w:val="D1369074"/>
@@ -1664,7 +2259,7 @@
       </w:rPr>
     </w:lvl>
   </w:abstractNum>
-  <w:abstractNum w:abstractNumId="3" w15:restartNumberingAfterBreak="0">
+  <w:abstractNum w:abstractNumId="4" w15:restartNumberingAfterBreak="0">
     <w:nsid w:val="63B55041"/>
     <w:multiLevelType w:val="multilevel"/>
     <w:tmpl w:val="25D4987E"/>
@@ -1817,13 +2412,16 @@
     <w:abstractNumId w:val="0"/>
   </w:num>
   <w:num w:numId="2" w16cid:durableId="768694022">
+    <w:abstractNumId w:val="3"/>
+  </w:num>
+  <w:num w:numId="3" w16cid:durableId="447966400">
     <w:abstractNumId w:val="2"/>
   </w:num>
-  <w:num w:numId="3" w16cid:durableId="447966400">
+  <w:num w:numId="4" w16cid:durableId="1232619956">
+    <w:abstractNumId w:val="4"/>
+  </w:num>
+  <w:num w:numId="5" w16cid:durableId="238833797">
     <w:abstractNumId w:val="1"/>
-  </w:num>
-  <w:num w:numId="4" w16cid:durableId="1232619956">
-    <w:abstractNumId w:val="3"/>
   </w:num>
 </w:numbering>
 </file>

</xml_diff>